<commit_message>
Finishings in SRS done
</commit_message>
<xml_diff>
--- a/Documentation/SRS_Video_Generator.docx
+++ b/Documentation/SRS_Video_Generator.docx
@@ -5,8 +5,6 @@
     <w:p>
       <w:pPr>
         <w:spacing w:after="0" w:line="240" w:lineRule="auto"/>
-        <w:ind w:firstLine="284"/>
-        <w:jc w:val="center"/>
         <w:rPr>
           <w:rFonts w:ascii="Arial" w:hAnsi="Arial" w:cs="Arial"/>
           <w:b/>
@@ -17,18 +15,6 @@
           <w:lang w:val="en-US"/>
         </w:rPr>
       </w:pPr>
-      <w:r>
-        <w:rPr>
-          <w:rFonts w:ascii="Arial" w:hAnsi="Arial" w:cs="Arial"/>
-          <w:b/>
-          <w:bCs/>
-          <w:color w:val="C00000"/>
-          <w:sz w:val="40"/>
-          <w:szCs w:val="40"/>
-          <w:lang w:val="en-US"/>
-        </w:rPr>
-        <w:t xml:space="preserve"> </w:t>
-      </w:r>
       <w:r>
         <w:rPr>
           <w:rFonts w:ascii="Arial" w:hAnsi="Arial" w:cs="Arial"/>
@@ -1076,6 +1062,9 @@
               <w:spacing w:before="120" w:after="0"/>
               <w:jc w:val="left"/>
             </w:pPr>
+            <w:r>
+              <w:t>22CIAD2A13</w:t>
+            </w:r>
           </w:p>
         </w:tc>
       </w:tr>
@@ -1295,11 +1284,23 @@
           <w:sz w:val="24"/>
           <w:szCs w:val="24"/>
         </w:rPr>
-        <w:t xml:space="preserve">Title of the Project: </w:t>
+        <w:t>Title of the Project:</w:t>
       </w:r>
       <w:r>
         <w:rPr>
           <w:rFonts w:ascii="Arial" w:hAnsi="Arial" w:cs="Arial"/>
+          <w:b/>
+          <w:bCs/>
+          <w:sz w:val="24"/>
+          <w:szCs w:val="24"/>
+        </w:rPr>
+        <w:t xml:space="preserve"> </w:t>
+      </w:r>
+      <w:r>
+        <w:rPr>
+          <w:rFonts w:ascii="Arial" w:hAnsi="Arial" w:cs="Arial"/>
+          <w:b/>
+          <w:bCs/>
           <w:sz w:val="24"/>
           <w:szCs w:val="24"/>
           <w:lang w:eastAsia="zh-CN" w:bidi="he-IL"/>
@@ -2751,7 +2752,7 @@
           <w:rStyle w:val="IndexLink"/>
           <w:lang w:val="en-IN" w:eastAsia="en-IN"/>
         </w:rPr>
-        <w:t>2</w:t>
+        <w:t>1</w:t>
       </w:r>
     </w:p>
     <w:p>
@@ -2800,16 +2801,8 @@
         <w:rPr>
           <w:lang w:val="en-IN" w:eastAsia="en-IN"/>
         </w:rPr>
-        <w:t>3</w:t>
-      </w:r>
-    </w:p>
-    <w:p>
-      <w:pPr>
-        <w:rPr>
-          <w:rFonts w:ascii="Times New Roman" w:hAnsi="Times New Roman" w:cs="Times New Roman"/>
-          <w:lang w:eastAsia="en-IN" w:bidi="he-IL"/>
-        </w:rPr>
-      </w:pPr>
+        <w:t>2</w:t>
+      </w:r>
     </w:p>
     <w:p>
       <w:pPr>
@@ -3015,7 +3008,7 @@
               <w:rPr>
                 <w:lang w:val="en-IN"/>
               </w:rPr>
-              <w:t>George Orwell</w:t>
+              <w:t>Durishetty Anirudh</w:t>
             </w:r>
           </w:p>
         </w:tc>
@@ -3060,53 +3053,12 @@
               <w:rPr>
                 <w:rFonts w:ascii="Arial" w:hAnsi="Arial" w:cs="Arial"/>
               </w:rPr>
-              <w:t>24/02/25</w:t>
+              <w:t>20/03/2025</w:t>
             </w:r>
           </w:p>
         </w:tc>
       </w:tr>
     </w:tbl>
-    <w:p>
-      <w:pPr>
-        <w:rPr>
-          <w:rFonts w:ascii="Arial" w:hAnsi="Arial" w:cs="Arial"/>
-          <w:b/>
-          <w:bCs/>
-          <w:sz w:val="24"/>
-          <w:szCs w:val="24"/>
-        </w:rPr>
-      </w:pPr>
-    </w:p>
-    <w:p>
-      <w:pPr>
-        <w:tabs>
-          <w:tab w:val="center" w:pos="4525"/>
-        </w:tabs>
-        <w:jc w:val="center"/>
-        <w:rPr>
-          <w:rFonts w:ascii="Arial" w:hAnsi="Arial" w:cs="Arial"/>
-          <w:b/>
-          <w:bCs/>
-          <w:sz w:val="24"/>
-          <w:szCs w:val="24"/>
-        </w:rPr>
-      </w:pPr>
-    </w:p>
-    <w:p>
-      <w:pPr>
-        <w:tabs>
-          <w:tab w:val="center" w:pos="4525"/>
-        </w:tabs>
-        <w:jc w:val="center"/>
-        <w:rPr>
-          <w:rFonts w:ascii="Arial" w:hAnsi="Arial" w:cs="Arial"/>
-          <w:b/>
-          <w:bCs/>
-          <w:sz w:val="24"/>
-          <w:szCs w:val="24"/>
-        </w:rPr>
-      </w:pPr>
-    </w:p>
     <w:p>
       <w:pPr>
         <w:tabs>
@@ -3127,6 +3079,19 @@
           <w:titlePg/>
           <w:docGrid w:linePitch="360"/>
         </w:sectPr>
+      </w:pPr>
+    </w:p>
+    <w:p>
+      <w:pPr>
+        <w:rPr>
+          <w:rFonts w:ascii="Arial" w:hAnsi="Arial" w:cs="Arial"/>
+          <w:b/>
+          <w:bCs/>
+          <w:color w:val="1F3864" w:themeColor="accent1" w:themeShade="80"/>
+          <w:sz w:val="40"/>
+          <w:szCs w:val="40"/>
+          <w:lang w:val="en-US"/>
+        </w:rPr>
       </w:pPr>
     </w:p>
     <w:p>
@@ -3167,6 +3132,7 @@
           <w:rFonts w:asciiTheme="minorHAnsi" w:hAnsiTheme="minorHAnsi" w:cstheme="minorHAnsi"/>
           <w:color w:val="FFFFFF"/>
         </w:rPr>
+        <w:lastRenderedPageBreak/>
         <w:t>Introduction</w:t>
       </w:r>
     </w:p>
@@ -3427,7 +3393,6 @@
         </w:rPr>
         <w:t xml:space="preserve"> Converts scripts into natural-sounding speech using </w:t>
       </w:r>
-      <w:proofErr w:type="spellStart"/>
       <w:r>
         <w:rPr>
           <w:rFonts w:cstheme="minorHAnsi"/>
@@ -3438,7 +3403,6 @@
         </w:rPr>
         <w:t>EdgeTTS</w:t>
       </w:r>
-      <w:proofErr w:type="spellEnd"/>
       <w:r>
         <w:rPr>
           <w:rFonts w:cstheme="minorHAnsi"/>
@@ -3533,7 +3497,6 @@
         </w:rPr>
         <w:t xml:space="preserve"> Retrieves relevant stock footage from </w:t>
       </w:r>
-      <w:proofErr w:type="spellStart"/>
       <w:r>
         <w:rPr>
           <w:rFonts w:cstheme="minorHAnsi"/>
@@ -3542,18 +3505,7 @@
           <w:sz w:val="24"/>
           <w:szCs w:val="24"/>
         </w:rPr>
-        <w:t>Pexels</w:t>
-      </w:r>
-      <w:proofErr w:type="spellEnd"/>
-      <w:r>
-        <w:rPr>
-          <w:rFonts w:cstheme="minorHAnsi"/>
-          <w:b/>
-          <w:bCs/>
-          <w:sz w:val="24"/>
-          <w:szCs w:val="24"/>
-        </w:rPr>
-        <w:t xml:space="preserve"> API</w:t>
+        <w:t>Pexels API</w:t>
       </w:r>
       <w:r>
         <w:rPr>
@@ -3597,7 +3549,6 @@
         </w:rPr>
         <w:t xml:space="preserve"> Developed using </w:t>
       </w:r>
-      <w:proofErr w:type="spellStart"/>
       <w:r>
         <w:rPr>
           <w:rFonts w:cstheme="minorHAnsi"/>
@@ -3608,7 +3559,6 @@
         </w:rPr>
         <w:t>Streamlit</w:t>
       </w:r>
-      <w:proofErr w:type="spellEnd"/>
       <w:r>
         <w:rPr>
           <w:rFonts w:cstheme="minorHAnsi"/>
@@ -4392,7 +4342,6 @@
         </w:rPr>
         <w:t xml:space="preserve"> Uses </w:t>
       </w:r>
-      <w:proofErr w:type="spellStart"/>
       <w:r>
         <w:rPr>
           <w:rFonts w:cstheme="minorHAnsi"/>
@@ -4403,7 +4352,6 @@
         </w:rPr>
         <w:t>EdgeTTS</w:t>
       </w:r>
-      <w:proofErr w:type="spellEnd"/>
       <w:r>
         <w:rPr>
           <w:rFonts w:cstheme="minorHAnsi"/>
@@ -4500,7 +4448,6 @@
         </w:rPr>
         <w:t xml:space="preserve"> Searches and selects suitable background footage from </w:t>
       </w:r>
-      <w:proofErr w:type="spellStart"/>
       <w:r>
         <w:rPr>
           <w:rFonts w:cstheme="minorHAnsi"/>
@@ -4509,44 +4456,15 @@
           <w:sz w:val="24"/>
           <w:szCs w:val="24"/>
         </w:rPr>
-        <w:t>Pexels</w:t>
-      </w:r>
-      <w:proofErr w:type="spellEnd"/>
-      <w:r>
-        <w:rPr>
-          <w:rFonts w:cstheme="minorHAnsi"/>
-          <w:b/>
-          <w:bCs/>
-          <w:sz w:val="24"/>
-          <w:szCs w:val="24"/>
-        </w:rPr>
-        <w:t xml:space="preserve"> API</w:t>
-      </w:r>
-      <w:r>
-        <w:rPr>
-          <w:rFonts w:cstheme="minorHAnsi"/>
-          <w:sz w:val="24"/>
-          <w:szCs w:val="24"/>
-        </w:rPr>
-        <w:t xml:space="preserve"> based on AI-</w:t>
-      </w:r>
-      <w:proofErr w:type="spellStart"/>
-      <w:r>
-        <w:rPr>
-          <w:rFonts w:cstheme="minorHAnsi"/>
-          <w:sz w:val="24"/>
-          <w:szCs w:val="24"/>
-        </w:rPr>
-        <w:t>analyzed</w:t>
-      </w:r>
-      <w:proofErr w:type="spellEnd"/>
-      <w:r>
-        <w:rPr>
-          <w:rFonts w:cstheme="minorHAnsi"/>
-          <w:sz w:val="24"/>
-          <w:szCs w:val="24"/>
-        </w:rPr>
-        <w:t xml:space="preserve"> keywords.</w:t>
+        <w:t>Pexels API</w:t>
+      </w:r>
+      <w:r>
+        <w:rPr>
+          <w:rFonts w:cstheme="minorHAnsi"/>
+          <w:sz w:val="24"/>
+          <w:szCs w:val="24"/>
+        </w:rPr>
+        <w:t xml:space="preserve"> based on AI-analyzed keywords.</w:t>
       </w:r>
     </w:p>
     <w:p>
@@ -4583,7 +4501,6 @@
         </w:rPr>
         <w:t xml:space="preserve"> Combines all elements using </w:t>
       </w:r>
-      <w:proofErr w:type="spellStart"/>
       <w:r>
         <w:rPr>
           <w:rFonts w:cstheme="minorHAnsi"/>
@@ -4592,31 +4509,8 @@
           <w:sz w:val="24"/>
           <w:szCs w:val="24"/>
         </w:rPr>
-        <w:t>MoviePy</w:t>
-      </w:r>
-      <w:proofErr w:type="spellEnd"/>
-      <w:r>
-        <w:rPr>
-          <w:rFonts w:cstheme="minorHAnsi"/>
-          <w:b/>
-          <w:bCs/>
-          <w:sz w:val="24"/>
-          <w:szCs w:val="24"/>
-        </w:rPr>
-        <w:t xml:space="preserve"> and </w:t>
-      </w:r>
-      <w:proofErr w:type="spellStart"/>
-      <w:r>
-        <w:rPr>
-          <w:rFonts w:cstheme="minorHAnsi"/>
-          <w:b/>
-          <w:bCs/>
-          <w:sz w:val="24"/>
-          <w:szCs w:val="24"/>
-        </w:rPr>
-        <w:t>FFmpeg</w:t>
-      </w:r>
-      <w:proofErr w:type="spellEnd"/>
+        <w:t>MoviePy and FFmpeg</w:t>
+      </w:r>
       <w:r>
         <w:rPr>
           <w:rFonts w:cstheme="minorHAnsi"/>
@@ -5114,47 +5008,7 @@
           <w:sz w:val="24"/>
           <w:szCs w:val="24"/>
         </w:rPr>
-        <w:t xml:space="preserve"> such as OpenAI, </w:t>
-      </w:r>
-      <w:proofErr w:type="spellStart"/>
-      <w:r>
-        <w:rPr>
-          <w:rFonts w:cstheme="minorHAnsi"/>
-          <w:iCs/>
-          <w:sz w:val="24"/>
-          <w:szCs w:val="24"/>
-        </w:rPr>
-        <w:t>EdgeTTS</w:t>
-      </w:r>
-      <w:proofErr w:type="spellEnd"/>
-      <w:r>
-        <w:rPr>
-          <w:rFonts w:cstheme="minorHAnsi"/>
-          <w:iCs/>
-          <w:sz w:val="24"/>
-          <w:szCs w:val="24"/>
-        </w:rPr>
-        <w:t xml:space="preserve">, and Whisper, ensuring high accuracy and reliability. Its implementation using Python and </w:t>
-      </w:r>
-      <w:proofErr w:type="spellStart"/>
-      <w:r>
-        <w:rPr>
-          <w:rFonts w:cstheme="minorHAnsi"/>
-          <w:iCs/>
-          <w:sz w:val="24"/>
-          <w:szCs w:val="24"/>
-        </w:rPr>
-        <w:t>Streamlit</w:t>
-      </w:r>
-      <w:proofErr w:type="spellEnd"/>
-      <w:r>
-        <w:rPr>
-          <w:rFonts w:cstheme="minorHAnsi"/>
-          <w:iCs/>
-          <w:sz w:val="24"/>
-          <w:szCs w:val="24"/>
-        </w:rPr>
-        <w:t xml:space="preserve"> ensures ease of development and scalability.</w:t>
+        <w:t xml:space="preserve"> such as OpenAI, EdgeTTS, and Whisper, ensuring high accuracy and reliability. Its implementation using Python and Streamlit ensures ease of development and scalability.</w:t>
       </w:r>
     </w:p>
     <w:p>
@@ -5345,27 +5199,7 @@
           <w:sz w:val="24"/>
           <w:szCs w:val="24"/>
         </w:rPr>
-        <w:t xml:space="preserve"> regarding media usage from external sources like </w:t>
-      </w:r>
-      <w:proofErr w:type="spellStart"/>
-      <w:r>
-        <w:rPr>
-          <w:rFonts w:cstheme="minorHAnsi"/>
-          <w:iCs/>
-          <w:sz w:val="24"/>
-          <w:szCs w:val="24"/>
-        </w:rPr>
-        <w:t>Pexels</w:t>
-      </w:r>
-      <w:proofErr w:type="spellEnd"/>
-      <w:r>
-        <w:rPr>
-          <w:rFonts w:cstheme="minorHAnsi"/>
-          <w:iCs/>
-          <w:sz w:val="24"/>
-          <w:szCs w:val="24"/>
-        </w:rPr>
-        <w:t xml:space="preserve"> API, ensuring legal adherence in content generation.</w:t>
+        <w:t xml:space="preserve"> regarding media usage from external sources like Pexels API, ensuring legal adherence in content generation.</w:t>
       </w:r>
     </w:p>
     <w:p>
@@ -5547,27 +5381,7 @@
           <w:sz w:val="24"/>
           <w:szCs w:val="24"/>
         </w:rPr>
-        <w:t xml:space="preserve"> Converts the script into speech using </w:t>
-      </w:r>
-      <w:proofErr w:type="spellStart"/>
-      <w:r>
-        <w:rPr>
-          <w:rFonts w:cstheme="minorHAnsi"/>
-          <w:iCs/>
-          <w:sz w:val="24"/>
-          <w:szCs w:val="24"/>
-        </w:rPr>
-        <w:t>EdgeTTS</w:t>
-      </w:r>
-      <w:proofErr w:type="spellEnd"/>
-      <w:r>
-        <w:rPr>
-          <w:rFonts w:cstheme="minorHAnsi"/>
-          <w:iCs/>
-          <w:sz w:val="24"/>
-          <w:szCs w:val="24"/>
-        </w:rPr>
-        <w:t>, offering multiple voice options.</w:t>
+        <w:t xml:space="preserve"> Converts the script into speech using EdgeTTS, offering multiple voice options.</w:t>
       </w:r>
     </w:p>
     <w:p>
@@ -5661,27 +5475,7 @@
           <w:sz w:val="24"/>
           <w:szCs w:val="24"/>
         </w:rPr>
-        <w:t xml:space="preserve"> Fetches visually relevant video clips from </w:t>
-      </w:r>
-      <w:proofErr w:type="spellStart"/>
-      <w:r>
-        <w:rPr>
-          <w:rFonts w:cstheme="minorHAnsi"/>
-          <w:iCs/>
-          <w:sz w:val="24"/>
-          <w:szCs w:val="24"/>
-        </w:rPr>
-        <w:t>Pexels</w:t>
-      </w:r>
-      <w:proofErr w:type="spellEnd"/>
-      <w:r>
-        <w:rPr>
-          <w:rFonts w:cstheme="minorHAnsi"/>
-          <w:iCs/>
-          <w:sz w:val="24"/>
-          <w:szCs w:val="24"/>
-        </w:rPr>
-        <w:t xml:space="preserve"> API.</w:t>
+        <w:t xml:space="preserve"> Fetches visually relevant video clips from Pexels API.</w:t>
       </w:r>
     </w:p>
     <w:p>
@@ -5718,47 +5512,7 @@
           <w:sz w:val="24"/>
           <w:szCs w:val="24"/>
         </w:rPr>
-        <w:t xml:space="preserve"> Uses </w:t>
-      </w:r>
-      <w:proofErr w:type="spellStart"/>
-      <w:r>
-        <w:rPr>
-          <w:rFonts w:cstheme="minorHAnsi"/>
-          <w:iCs/>
-          <w:sz w:val="24"/>
-          <w:szCs w:val="24"/>
-        </w:rPr>
-        <w:t>MoviePy</w:t>
-      </w:r>
-      <w:proofErr w:type="spellEnd"/>
-      <w:r>
-        <w:rPr>
-          <w:rFonts w:cstheme="minorHAnsi"/>
-          <w:iCs/>
-          <w:sz w:val="24"/>
-          <w:szCs w:val="24"/>
-        </w:rPr>
-        <w:t xml:space="preserve"> and </w:t>
-      </w:r>
-      <w:proofErr w:type="spellStart"/>
-      <w:r>
-        <w:rPr>
-          <w:rFonts w:cstheme="minorHAnsi"/>
-          <w:iCs/>
-          <w:sz w:val="24"/>
-          <w:szCs w:val="24"/>
-        </w:rPr>
-        <w:t>FFmpeg</w:t>
-      </w:r>
-      <w:proofErr w:type="spellEnd"/>
-      <w:r>
-        <w:rPr>
-          <w:rFonts w:cstheme="minorHAnsi"/>
-          <w:iCs/>
-          <w:sz w:val="24"/>
-          <w:szCs w:val="24"/>
-        </w:rPr>
-        <w:t xml:space="preserve"> to merge all assets into a final video.</w:t>
+        <w:t xml:space="preserve"> Uses MoviePy and FFmpeg to merge all assets into a final video.</w:t>
       </w:r>
     </w:p>
     <w:p>
@@ -5976,43 +5730,7 @@
           <w:szCs w:val="24"/>
           <w:lang w:eastAsia="zh-CN" w:bidi="he-IL"/>
         </w:rPr>
-        <w:t xml:space="preserve"> The system relies on third-party APIs such as OpenAI, </w:t>
-      </w:r>
-      <w:proofErr w:type="spellStart"/>
-      <w:r>
-        <w:rPr>
-          <w:sz w:val="24"/>
-          <w:szCs w:val="24"/>
-          <w:lang w:eastAsia="zh-CN" w:bidi="he-IL"/>
-        </w:rPr>
-        <w:t>EdgeTTS</w:t>
-      </w:r>
-      <w:proofErr w:type="spellEnd"/>
-      <w:r>
-        <w:rPr>
-          <w:sz w:val="24"/>
-          <w:szCs w:val="24"/>
-          <w:lang w:eastAsia="zh-CN" w:bidi="he-IL"/>
-        </w:rPr>
-        <w:t xml:space="preserve">, and </w:t>
-      </w:r>
-      <w:proofErr w:type="spellStart"/>
-      <w:r>
-        <w:rPr>
-          <w:sz w:val="24"/>
-          <w:szCs w:val="24"/>
-          <w:lang w:eastAsia="zh-CN" w:bidi="he-IL"/>
-        </w:rPr>
-        <w:t>Pexels</w:t>
-      </w:r>
-      <w:proofErr w:type="spellEnd"/>
-      <w:r>
-        <w:rPr>
-          <w:sz w:val="24"/>
-          <w:szCs w:val="24"/>
-          <w:lang w:eastAsia="zh-CN" w:bidi="he-IL"/>
-        </w:rPr>
-        <w:t>, which have rate limits that could impact real-time processing.</w:t>
+        <w:t xml:space="preserve"> The system relies on third-party APIs such as OpenAI, EdgeTTS, and Pexels, which have rate limits that could impact real-time processing.</w:t>
       </w:r>
     </w:p>
     <w:p>
@@ -6105,43 +5823,7 @@
           <w:szCs w:val="24"/>
           <w:lang w:eastAsia="zh-CN" w:bidi="he-IL"/>
         </w:rPr>
-        <w:t xml:space="preserve"> The platform depends on multiple Python libraries (e.g., </w:t>
-      </w:r>
-      <w:proofErr w:type="spellStart"/>
-      <w:r>
-        <w:rPr>
-          <w:sz w:val="24"/>
-          <w:szCs w:val="24"/>
-          <w:lang w:eastAsia="zh-CN" w:bidi="he-IL"/>
-        </w:rPr>
-        <w:t>MoviePy</w:t>
-      </w:r>
-      <w:proofErr w:type="spellEnd"/>
-      <w:r>
-        <w:rPr>
-          <w:sz w:val="24"/>
-          <w:szCs w:val="24"/>
-          <w:lang w:eastAsia="zh-CN" w:bidi="he-IL"/>
-        </w:rPr>
-        <w:t xml:space="preserve">, </w:t>
-      </w:r>
-      <w:proofErr w:type="spellStart"/>
-      <w:r>
-        <w:rPr>
-          <w:sz w:val="24"/>
-          <w:szCs w:val="24"/>
-          <w:lang w:eastAsia="zh-CN" w:bidi="he-IL"/>
-        </w:rPr>
-        <w:t>FFmpeg</w:t>
-      </w:r>
-      <w:proofErr w:type="spellEnd"/>
-      <w:r>
-        <w:rPr>
-          <w:sz w:val="24"/>
-          <w:szCs w:val="24"/>
-          <w:lang w:eastAsia="zh-CN" w:bidi="he-IL"/>
-        </w:rPr>
-        <w:t>, OpenAI API), requiring continuous updates and compatibility maintenance.</w:t>
+        <w:t xml:space="preserve"> The platform depends on multiple Python libraries (e.g., MoviePy, FFmpeg, OpenAI API), requiring continuous updates and compatibility maintenance.</w:t>
       </w:r>
     </w:p>
     <w:p>
@@ -6172,25 +5854,7 @@
           <w:szCs w:val="24"/>
           <w:lang w:eastAsia="zh-CN" w:bidi="he-IL"/>
         </w:rPr>
-        <w:t xml:space="preserve"> The </w:t>
-      </w:r>
-      <w:proofErr w:type="spellStart"/>
-      <w:r>
-        <w:rPr>
-          <w:sz w:val="24"/>
-          <w:szCs w:val="24"/>
-          <w:lang w:eastAsia="zh-CN" w:bidi="he-IL"/>
-        </w:rPr>
-        <w:t>Streamlit</w:t>
-      </w:r>
-      <w:proofErr w:type="spellEnd"/>
-      <w:r>
-        <w:rPr>
-          <w:sz w:val="24"/>
-          <w:szCs w:val="24"/>
-          <w:lang w:eastAsia="zh-CN" w:bidi="he-IL"/>
-        </w:rPr>
-        <w:t>-based GUI should provide a seamless experience, ensuring minimal latency between user input and AI processing output.</w:t>
+        <w:t xml:space="preserve"> The Streamlit-based GUI should provide a seamless experience, ensuring minimal latency between user input and AI processing output.</w:t>
       </w:r>
     </w:p>
     <w:p>
@@ -6293,21 +5957,7 @@
         <w:rPr>
           <w:lang w:eastAsia="zh-CN" w:bidi="he-IL"/>
         </w:rPr>
-        <w:t xml:space="preserve"> The system assumes that OpenAI’s ChatGPT, </w:t>
-      </w:r>
-      <w:proofErr w:type="spellStart"/>
-      <w:r>
-        <w:rPr>
-          <w:lang w:eastAsia="zh-CN" w:bidi="he-IL"/>
-        </w:rPr>
-        <w:t>EdgeTTS</w:t>
-      </w:r>
-      <w:proofErr w:type="spellEnd"/>
-      <w:r>
-        <w:rPr>
-          <w:lang w:eastAsia="zh-CN" w:bidi="he-IL"/>
-        </w:rPr>
-        <w:t>, and Whisper will remain available and functional during operation.</w:t>
+        <w:t xml:space="preserve"> The system assumes that OpenAI’s ChatGPT, EdgeTTS, and Whisper will remain available and functional during operation.</w:t>
       </w:r>
     </w:p>
     <w:p>
@@ -6345,43 +5995,19 @@
           <w:lang w:eastAsia="zh-CN" w:bidi="he-IL"/>
         </w:rPr>
       </w:pPr>
-      <w:proofErr w:type="spellStart"/>
       <w:r>
         <w:rPr>
           <w:b/>
           <w:bCs/>
           <w:lang w:eastAsia="zh-CN" w:bidi="he-IL"/>
         </w:rPr>
-        <w:t>Pexels</w:t>
-      </w:r>
-      <w:proofErr w:type="spellEnd"/>
-      <w:r>
-        <w:rPr>
-          <w:b/>
-          <w:bCs/>
+        <w:t>Pexels Video Database Accessibility:</w:t>
+      </w:r>
+      <w:r>
+        <w:rPr>
           <w:lang w:eastAsia="zh-CN" w:bidi="he-IL"/>
         </w:rPr>
-        <w:t xml:space="preserve"> Video Database Accessibility:</w:t>
-      </w:r>
-      <w:r>
-        <w:rPr>
-          <w:lang w:eastAsia="zh-CN" w:bidi="he-IL"/>
-        </w:rPr>
-        <w:t xml:space="preserve"> The background video search feature depends on </w:t>
-      </w:r>
-      <w:proofErr w:type="spellStart"/>
-      <w:r>
-        <w:rPr>
-          <w:lang w:eastAsia="zh-CN" w:bidi="he-IL"/>
-        </w:rPr>
-        <w:t>Pexels</w:t>
-      </w:r>
-      <w:proofErr w:type="spellEnd"/>
-      <w:r>
-        <w:rPr>
-          <w:lang w:eastAsia="zh-CN" w:bidi="he-IL"/>
-        </w:rPr>
-        <w:t xml:space="preserve"> API, assuming that sufficient stock video assets exist for diverse keywords.</w:t>
+        <w:t xml:space="preserve"> The background video search feature depends on Pexels API, assuming that sufficient stock video assets exist for diverse keywords.</w:t>
       </w:r>
     </w:p>
     <w:p>
@@ -6667,27 +6293,7 @@
           <w:sz w:val="24"/>
           <w:szCs w:val="24"/>
         </w:rPr>
-        <w:t xml:space="preserve"> </w:t>
-      </w:r>
-      <w:proofErr w:type="spellStart"/>
-      <w:r>
-        <w:rPr>
-          <w:rFonts w:cstheme="minorHAnsi"/>
-          <w:iCs/>
-          <w:sz w:val="24"/>
-          <w:szCs w:val="24"/>
-        </w:rPr>
-        <w:t>Streamlit</w:t>
-      </w:r>
-      <w:proofErr w:type="spellEnd"/>
-      <w:r>
-        <w:rPr>
-          <w:rFonts w:cstheme="minorHAnsi"/>
-          <w:iCs/>
-          <w:sz w:val="24"/>
-          <w:szCs w:val="24"/>
-        </w:rPr>
-        <w:t xml:space="preserve"> for UI and API interactions.</w:t>
+        <w:t xml:space="preserve"> Streamlit for UI and API interactions.</w:t>
       </w:r>
     </w:p>
     <w:p>
@@ -6723,67 +6329,7 @@
           <w:sz w:val="24"/>
           <w:szCs w:val="24"/>
         </w:rPr>
-        <w:t xml:space="preserve"> OpenAI API, </w:t>
-      </w:r>
-      <w:proofErr w:type="spellStart"/>
-      <w:r>
-        <w:rPr>
-          <w:rFonts w:cstheme="minorHAnsi"/>
-          <w:iCs/>
-          <w:sz w:val="24"/>
-          <w:szCs w:val="24"/>
-        </w:rPr>
-        <w:t>EdgeTTS</w:t>
-      </w:r>
-      <w:proofErr w:type="spellEnd"/>
-      <w:r>
-        <w:rPr>
-          <w:rFonts w:cstheme="minorHAnsi"/>
-          <w:iCs/>
-          <w:sz w:val="24"/>
-          <w:szCs w:val="24"/>
-        </w:rPr>
-        <w:t xml:space="preserve">, Whisper, </w:t>
-      </w:r>
-      <w:proofErr w:type="spellStart"/>
-      <w:r>
-        <w:rPr>
-          <w:rFonts w:cstheme="minorHAnsi"/>
-          <w:iCs/>
-          <w:sz w:val="24"/>
-          <w:szCs w:val="24"/>
-        </w:rPr>
-        <w:t>MoviePy</w:t>
-      </w:r>
-      <w:proofErr w:type="spellEnd"/>
-      <w:r>
-        <w:rPr>
-          <w:rFonts w:cstheme="minorHAnsi"/>
-          <w:iCs/>
-          <w:sz w:val="24"/>
-          <w:szCs w:val="24"/>
-        </w:rPr>
-        <w:t xml:space="preserve">, </w:t>
-      </w:r>
-      <w:proofErr w:type="spellStart"/>
-      <w:r>
-        <w:rPr>
-          <w:rFonts w:cstheme="minorHAnsi"/>
-          <w:iCs/>
-          <w:sz w:val="24"/>
-          <w:szCs w:val="24"/>
-        </w:rPr>
-        <w:t>FFmpeg</w:t>
-      </w:r>
-      <w:proofErr w:type="spellEnd"/>
-      <w:r>
-        <w:rPr>
-          <w:rFonts w:cstheme="minorHAnsi"/>
-          <w:iCs/>
-          <w:sz w:val="24"/>
-          <w:szCs w:val="24"/>
-        </w:rPr>
-        <w:t>, NumPy, Pandas.</w:t>
+        <w:t xml:space="preserve"> OpenAI API, EdgeTTS, Whisper, MoviePy, FFmpeg, NumPy, Pandas.</w:t>
       </w:r>
     </w:p>
     <w:p>
@@ -6942,23 +6488,13 @@
         </w:rPr>
         <w:t xml:space="preserve"> </w:t>
       </w:r>
-      <w:proofErr w:type="spellStart"/>
-      <w:r>
-        <w:rPr>
-          <w:rFonts w:cstheme="minorHAnsi"/>
-          <w:sz w:val="24"/>
-          <w:szCs w:val="24"/>
-        </w:rPr>
-        <w:t>Ryzen</w:t>
-      </w:r>
-      <w:proofErr w:type="spellEnd"/>
-      <w:r>
-        <w:rPr>
-          <w:rFonts w:cstheme="minorHAnsi"/>
-          <w:sz w:val="24"/>
-          <w:szCs w:val="24"/>
-        </w:rPr>
-        <w:t xml:space="preserve"> 7 5800H.</w:t>
+      <w:r>
+        <w:rPr>
+          <w:rFonts w:cstheme="minorHAnsi"/>
+          <w:sz w:val="24"/>
+          <w:szCs w:val="24"/>
+        </w:rPr>
+        <w:t>Ryzen 7 5800H.</w:t>
       </w:r>
     </w:p>
     <w:p>
@@ -7191,13 +6727,6 @@
         <w:lastRenderedPageBreak/>
         <w:t>Use Case Model</w:t>
       </w:r>
-    </w:p>
-    <w:p>
-      <w:pPr>
-        <w:rPr>
-          <w:lang w:val="en-CA" w:eastAsia="zh-CN" w:bidi="he-IL"/>
-        </w:rPr>
-      </w:pPr>
     </w:p>
     <w:p>
       <w:pPr>
@@ -7273,6 +6802,56 @@
     </w:p>
     <w:p>
       <w:pPr>
+        <w:jc w:val="center"/>
+        <w:rPr>
+          <w:rFonts w:eastAsia="MS Mincho" w:cstheme="minorHAnsi"/>
+          <w:iCs/>
+          <w:lang w:eastAsia="ja-JP"/>
+        </w:rPr>
+      </w:pPr>
+      <w:r>
+        <w:rPr>
+          <w:rFonts w:eastAsia="MS Mincho" w:cstheme="minorHAnsi"/>
+          <w:b/>
+          <w:bCs/>
+          <w:iCs/>
+          <w:lang w:eastAsia="ja-JP"/>
+        </w:rPr>
+        <w:t xml:space="preserve">Fig </w:t>
+      </w:r>
+      <w:r>
+        <w:rPr>
+          <w:rFonts w:eastAsia="MS Mincho" w:cstheme="minorHAnsi"/>
+          <w:b/>
+          <w:bCs/>
+          <w:iCs/>
+          <w:lang w:eastAsia="ja-JP"/>
+        </w:rPr>
+        <w:t>3.3</w:t>
+      </w:r>
+      <w:r>
+        <w:rPr>
+          <w:rFonts w:eastAsia="MS Mincho" w:cstheme="minorHAnsi"/>
+          <w:b/>
+          <w:bCs/>
+          <w:iCs/>
+          <w:lang w:eastAsia="ja-JP"/>
+        </w:rPr>
+        <w:t xml:space="preserve"> </w:t>
+      </w:r>
+      <w:r>
+        <w:rPr>
+          <w:rFonts w:eastAsia="MS Mincho" w:cstheme="minorHAnsi"/>
+          <w:b/>
+          <w:bCs/>
+          <w:iCs/>
+          <w:lang w:eastAsia="ja-JP"/>
+        </w:rPr>
+        <w:t>Use Case Diagram for AI-Driven Automated Video Generator for Content Creation</w:t>
+      </w:r>
+    </w:p>
+    <w:p>
+      <w:pPr>
         <w:suppressAutoHyphens/>
         <w:spacing w:after="0" w:line="276" w:lineRule="auto"/>
         <w:rPr>
@@ -7676,7 +7255,27 @@
           <w:szCs w:val="24"/>
           <w:lang w:eastAsia="ja-JP"/>
         </w:rPr>
-        <w:t>The system fails to find a relevant stock video, prompting the user to upload their own.</w:t>
+        <w:t xml:space="preserve">The system fails to find a relevant stock video, prompting the user to upload their </w:t>
+      </w:r>
+      <w:r>
+        <w:rPr>
+          <w:rFonts w:eastAsia="MS Mincho" w:cstheme="minorHAnsi"/>
+          <w:iCs/>
+          <w:sz w:val="24"/>
+          <w:szCs w:val="24"/>
+          <w:lang w:eastAsia="ja-JP"/>
+        </w:rPr>
+        <w:t>o</w:t>
+      </w:r>
+      <w:r>
+        <w:rPr>
+          <w:rFonts w:eastAsia="MS Mincho" w:cstheme="minorHAnsi"/>
+          <w:iCs/>
+          <w:sz w:val="24"/>
+          <w:szCs w:val="24"/>
+          <w:lang w:eastAsia="ja-JP"/>
+        </w:rPr>
+        <w:t>wn.</w:t>
       </w:r>
     </w:p>
     <w:p>
@@ -7748,28 +7347,23 @@
     </w:p>
     <w:p>
       <w:pPr>
-        <w:pStyle w:val="Heading3"/>
+        <w:pStyle w:val="Heading2"/>
         <w:numPr>
-          <w:ilvl w:val="2"/>
-          <w:numId w:val="47"/>
+          <w:ilvl w:val="1"/>
+          <w:numId w:val="31"/>
         </w:numPr>
-        <w:spacing w:before="0" w:line="240" w:lineRule="auto"/>
+        <w:spacing w:before="0" w:after="0" w:line="276" w:lineRule="auto"/>
+        <w:ind w:left="284" w:hanging="284"/>
         <w:rPr>
           <w:rFonts w:asciiTheme="minorHAnsi" w:hAnsiTheme="minorHAnsi" w:cstheme="minorHAnsi"/>
-          <w:b/>
-          <w:bCs/>
-          <w:color w:val="0D0D0D" w:themeColor="text1" w:themeTint="F2"/>
         </w:rPr>
       </w:pPr>
       <w:r>
         <w:rPr>
           <w:rFonts w:asciiTheme="minorHAnsi" w:hAnsiTheme="minorHAnsi" w:cstheme="minorHAnsi"/>
-          <w:b/>
-          <w:bCs/>
-          <w:color w:val="0D0D0D" w:themeColor="text1" w:themeTint="F2"/>
         </w:rPr>
         <w:lastRenderedPageBreak/>
-        <w:t>Data Flow Diagram</w:t>
+        <w:t>System Architecture</w:t>
       </w:r>
     </w:p>
     <w:p/>
@@ -7848,6 +7442,53 @@
     <w:p>
       <w:pPr>
         <w:rPr>
+          <w:lang w:val="en-CA" w:eastAsia="zh-CN" w:bidi="he-IL"/>
+        </w:rPr>
+      </w:pPr>
+    </w:p>
+    <w:p>
+      <w:pPr>
+        <w:jc w:val="center"/>
+        <w:rPr>
+          <w:lang w:val="en-CA" w:eastAsia="zh-CN" w:bidi="he-IL"/>
+        </w:rPr>
+      </w:pPr>
+      <w:r>
+        <w:rPr>
+          <w:b/>
+          <w:bCs/>
+          <w:lang w:eastAsia="zh-CN" w:bidi="he-IL"/>
+        </w:rPr>
+        <w:t xml:space="preserve">Fig </w:t>
+      </w:r>
+      <w:r>
+        <w:rPr>
+          <w:b/>
+          <w:bCs/>
+          <w:lang w:eastAsia="zh-CN" w:bidi="he-IL"/>
+        </w:rPr>
+        <w:t>3.4</w:t>
+      </w:r>
+      <w:r>
+        <w:rPr>
+          <w:b/>
+          <w:bCs/>
+          <w:lang w:eastAsia="zh-CN" w:bidi="he-IL"/>
+        </w:rPr>
+        <w:t xml:space="preserve"> </w:t>
+      </w:r>
+      <w:r>
+        <w:rPr>
+          <w:b/>
+          <w:bCs/>
+          <w:lang w:eastAsia="zh-CN" w:bidi="he-IL"/>
+        </w:rPr>
+        <w:t>System Architecture of AI-Driven Automated Video Generator for Content Creation</w:t>
+      </w:r>
+    </w:p>
+    <w:p>
+      <w:pPr>
+        <w:rPr>
           <w:rFonts w:cstheme="minorHAnsi"/>
           <w:lang w:val="en-CA" w:eastAsia="zh-CN" w:bidi="he-IL"/>
         </w:rPr>
@@ -8252,47 +7893,7 @@
           <w:sz w:val="24"/>
           <w:szCs w:val="24"/>
         </w:rPr>
-        <w:t xml:space="preserve"> API requests to OpenAI, </w:t>
-      </w:r>
-      <w:proofErr w:type="spellStart"/>
-      <w:r>
-        <w:rPr>
-          <w:rFonts w:cstheme="minorHAnsi"/>
-          <w:iCs/>
-          <w:sz w:val="24"/>
-          <w:szCs w:val="24"/>
-        </w:rPr>
-        <w:t>EdgeTTS</w:t>
-      </w:r>
-      <w:proofErr w:type="spellEnd"/>
-      <w:r>
-        <w:rPr>
-          <w:rFonts w:cstheme="minorHAnsi"/>
-          <w:iCs/>
-          <w:sz w:val="24"/>
-          <w:szCs w:val="24"/>
-        </w:rPr>
-        <w:t xml:space="preserve">, and </w:t>
-      </w:r>
-      <w:proofErr w:type="spellStart"/>
-      <w:r>
-        <w:rPr>
-          <w:rFonts w:cstheme="minorHAnsi"/>
-          <w:iCs/>
-          <w:sz w:val="24"/>
-          <w:szCs w:val="24"/>
-        </w:rPr>
-        <w:t>Pexels</w:t>
-      </w:r>
-      <w:proofErr w:type="spellEnd"/>
-      <w:r>
-        <w:rPr>
-          <w:rFonts w:cstheme="minorHAnsi"/>
-          <w:iCs/>
-          <w:sz w:val="24"/>
-          <w:szCs w:val="24"/>
-        </w:rPr>
-        <w:t xml:space="preserve"> should be optimized to minimize response delays.</w:t>
+        <w:t xml:space="preserve"> API requests to OpenAI, EdgeTTS, and Pexels should be optimized to minimize response delays.</w:t>
       </w:r>
     </w:p>
     <w:p>
@@ -9271,22 +8872,8 @@
           <w:szCs w:val="24"/>
           <w:lang w:eastAsia="en-IN"/>
         </w:rPr>
-        <w:t xml:space="preserve">royalty-free stock videos from sources like </w:t>
-      </w:r>
-      <w:proofErr w:type="spellStart"/>
-      <w:r>
-        <w:rPr>
-          <w:rFonts w:cstheme="minorHAnsi"/>
-          <w:b/>
-          <w:bCs/>
-          <w:iCs/>
-          <w:sz w:val="24"/>
-          <w:szCs w:val="24"/>
-          <w:lang w:eastAsia="en-IN"/>
-        </w:rPr>
-        <w:t>Pexels</w:t>
-      </w:r>
-      <w:proofErr w:type="spellEnd"/>
+        <w:t>royalty-free stock videos from sources like Pexels</w:t>
+      </w:r>
       <w:r>
         <w:rPr>
           <w:rFonts w:cstheme="minorHAnsi"/>
@@ -9418,32 +9005,6 @@
         </w:rPr>
         <w:t>.</w:t>
       </w:r>
-    </w:p>
-    <w:p>
-      <w:pPr>
-        <w:spacing w:after="0" w:line="276" w:lineRule="auto"/>
-        <w:rPr>
-          <w:rFonts w:cstheme="minorHAnsi"/>
-          <w:b/>
-          <w:bCs/>
-          <w:iCs/>
-          <w:sz w:val="24"/>
-          <w:szCs w:val="24"/>
-        </w:rPr>
-      </w:pPr>
-    </w:p>
-    <w:p>
-      <w:pPr>
-        <w:spacing w:after="0" w:line="276" w:lineRule="auto"/>
-        <w:rPr>
-          <w:rFonts w:cstheme="minorHAnsi"/>
-          <w:b/>
-          <w:bCs/>
-          <w:iCs/>
-          <w:sz w:val="24"/>
-          <w:szCs w:val="24"/>
-        </w:rPr>
-      </w:pPr>
     </w:p>
     <w:p>
       <w:pPr>
@@ -9536,144 +9097,6 @@
         </w:rPr>
         <w:t xml:space="preserve"> with minimal modifications. </w:t>
       </w:r>
-    </w:p>
-    <w:p>
-      <w:pPr>
-        <w:pStyle w:val="ListParagraph"/>
-        <w:numPr>
-          <w:ilvl w:val="0"/>
-          <w:numId w:val="69"/>
-        </w:numPr>
-        <w:spacing w:after="0" w:line="276" w:lineRule="auto"/>
-        <w:rPr>
-          <w:rFonts w:eastAsia="Times New Roman" w:cstheme="minorHAnsi"/>
-          <w:kern w:val="0"/>
-          <w:sz w:val="24"/>
-          <w:szCs w:val="24"/>
-          <w:lang w:eastAsia="en-IN"/>
-          <w14:ligatures w14:val="none"/>
-        </w:rPr>
-      </w:pPr>
-      <w:r>
-        <w:rPr>
-          <w:rFonts w:eastAsia="Times New Roman" w:cstheme="minorHAnsi"/>
-          <w:b/>
-          <w:bCs/>
-          <w:kern w:val="0"/>
-          <w:sz w:val="24"/>
-          <w:szCs w:val="24"/>
-          <w:lang w:eastAsia="en-IN"/>
-          <w14:ligatures w14:val="none"/>
-        </w:rPr>
-        <w:t>R2. Prebuilt Video Templates:</w:t>
-      </w:r>
-      <w:r>
-        <w:rPr>
-          <w:rFonts w:eastAsia="Times New Roman" w:cstheme="minorHAnsi"/>
-          <w:kern w:val="0"/>
-          <w:sz w:val="24"/>
-          <w:szCs w:val="24"/>
-          <w:lang w:eastAsia="en-IN"/>
-          <w14:ligatures w14:val="none"/>
-        </w:rPr>
-        <w:t xml:space="preserve"> Users should be able to select </w:t>
-      </w:r>
-      <w:r>
-        <w:rPr>
-          <w:rFonts w:eastAsia="Times New Roman" w:cstheme="minorHAnsi"/>
-          <w:b/>
-          <w:bCs/>
-          <w:kern w:val="0"/>
-          <w:sz w:val="24"/>
-          <w:szCs w:val="24"/>
-          <w:lang w:eastAsia="en-IN"/>
-          <w14:ligatures w14:val="none"/>
-        </w:rPr>
-        <w:t>reusable templates</w:t>
-      </w:r>
-      <w:r>
-        <w:rPr>
-          <w:rFonts w:eastAsia="Times New Roman" w:cstheme="minorHAnsi"/>
-          <w:kern w:val="0"/>
-          <w:sz w:val="24"/>
-          <w:szCs w:val="24"/>
-          <w:lang w:eastAsia="en-IN"/>
-          <w14:ligatures w14:val="none"/>
-        </w:rPr>
-        <w:t xml:space="preserve"> to maintain consistent branding across multiple video projects. </w:t>
-      </w:r>
-    </w:p>
-    <w:p>
-      <w:pPr>
-        <w:pStyle w:val="ListParagraph"/>
-        <w:numPr>
-          <w:ilvl w:val="0"/>
-          <w:numId w:val="69"/>
-        </w:numPr>
-        <w:spacing w:line="276" w:lineRule="auto"/>
-        <w:rPr>
-          <w:rFonts w:cstheme="minorHAnsi"/>
-          <w:lang w:val="en-CA" w:eastAsia="zh-CN" w:bidi="he-IL"/>
-        </w:rPr>
-      </w:pPr>
-      <w:r>
-        <w:rPr>
-          <w:rFonts w:eastAsia="Times New Roman" w:cstheme="minorHAnsi"/>
-          <w:b/>
-          <w:bCs/>
-          <w:kern w:val="0"/>
-          <w:sz w:val="24"/>
-          <w:szCs w:val="24"/>
-          <w:lang w:eastAsia="en-IN"/>
-          <w14:ligatures w14:val="none"/>
-        </w:rPr>
-        <w:t>R3. Cloud-Based Storage &amp; Asset Reuse:</w:t>
-      </w:r>
-      <w:r>
-        <w:rPr>
-          <w:rFonts w:eastAsia="Times New Roman" w:cstheme="minorHAnsi"/>
-          <w:kern w:val="0"/>
-          <w:sz w:val="24"/>
-          <w:szCs w:val="24"/>
-          <w:lang w:eastAsia="en-IN"/>
-          <w14:ligatures w14:val="none"/>
-        </w:rPr>
-        <w:t xml:space="preserve"> Frequently used assets such as </w:t>
-      </w:r>
-      <w:r>
-        <w:rPr>
-          <w:rFonts w:eastAsia="Times New Roman" w:cstheme="minorHAnsi"/>
-          <w:b/>
-          <w:bCs/>
-          <w:kern w:val="0"/>
-          <w:sz w:val="24"/>
-          <w:szCs w:val="24"/>
-          <w:lang w:eastAsia="en-IN"/>
-          <w14:ligatures w14:val="none"/>
-        </w:rPr>
-        <w:t>background videos, animations, and voice styles</w:t>
-      </w:r>
-      <w:r>
-        <w:rPr>
-          <w:rFonts w:eastAsia="Times New Roman" w:cstheme="minorHAnsi"/>
-          <w:kern w:val="0"/>
-          <w:sz w:val="24"/>
-          <w:szCs w:val="24"/>
-          <w:lang w:eastAsia="en-IN"/>
-          <w14:ligatures w14:val="none"/>
-        </w:rPr>
-        <w:t xml:space="preserve"> should be stored and retrieved efficiently for future projects.</w:t>
-      </w:r>
-    </w:p>
-    <w:p>
-      <w:pPr>
-        <w:pStyle w:val="ListParagraph"/>
-        <w:spacing w:line="276" w:lineRule="auto"/>
-        <w:rPr>
-          <w:rFonts w:cstheme="minorHAnsi"/>
-          <w:lang w:val="en-CA" w:eastAsia="zh-CN" w:bidi="he-IL"/>
-        </w:rPr>
-      </w:pPr>
     </w:p>
     <w:p>
       <w:pPr>
@@ -9824,7 +9247,6 @@
           <w:bdr w:val="none" w:sz="0" w:space="0" w:color="000000"/>
         </w:rPr>
       </w:pPr>
-      <w:proofErr w:type="spellStart"/>
       <w:r>
         <w:rPr>
           <w:rFonts w:cstheme="minorHAnsi"/>
@@ -9838,7 +9260,6 @@
         </w:rPr>
         <w:t>Streamlit</w:t>
       </w:r>
-      <w:proofErr w:type="spellEnd"/>
       <w:r>
         <w:rPr>
           <w:rFonts w:cstheme="minorHAnsi"/>
@@ -9873,7 +9294,6 @@
           <w:bdr w:val="none" w:sz="0" w:space="0" w:color="000000"/>
         </w:rPr>
       </w:pPr>
-      <w:proofErr w:type="spellStart"/>
       <w:r>
         <w:rPr>
           <w:rFonts w:cstheme="minorHAnsi"/>
@@ -9885,37 +9305,8 @@
           <w:szCs w:val="24"/>
           <w:bdr w:val="none" w:sz="0" w:space="0" w:color="000000"/>
         </w:rPr>
-        <w:t>MoviePy</w:t>
-      </w:r>
-      <w:proofErr w:type="spellEnd"/>
-      <w:r>
-        <w:rPr>
-          <w:rFonts w:cstheme="minorHAnsi"/>
-          <w:b/>
-          <w:bCs/>
-          <w:iCs/>
-          <w:color w:val="1B1C1D"/>
-          <w:sz w:val="24"/>
-          <w:szCs w:val="24"/>
-          <w:bdr w:val="none" w:sz="0" w:space="0" w:color="000000"/>
-        </w:rPr>
-        <w:t xml:space="preserve"> &amp; </w:t>
-      </w:r>
-      <w:proofErr w:type="spellStart"/>
-      <w:r>
-        <w:rPr>
-          <w:rFonts w:cstheme="minorHAnsi"/>
-          <w:b/>
-          <w:bCs/>
-          <w:iCs/>
-          <w:color w:val="1B1C1D"/>
-          <w:sz w:val="24"/>
-          <w:szCs w:val="24"/>
-          <w:bdr w:val="none" w:sz="0" w:space="0" w:color="000000"/>
-        </w:rPr>
-        <w:t>FFmpeg</w:t>
-      </w:r>
-      <w:proofErr w:type="spellEnd"/>
+        <w:t>MoviePy &amp; FFmpeg</w:t>
+      </w:r>
       <w:r>
         <w:rPr>
           <w:rFonts w:cstheme="minorHAnsi"/>
@@ -9950,7 +9341,6 @@
           <w:bdr w:val="none" w:sz="0" w:space="0" w:color="000000"/>
         </w:rPr>
       </w:pPr>
-      <w:proofErr w:type="spellStart"/>
       <w:r>
         <w:rPr>
           <w:rFonts w:cstheme="minorHAnsi"/>
@@ -9962,21 +9352,7 @@
           <w:szCs w:val="24"/>
           <w:bdr w:val="none" w:sz="0" w:space="0" w:color="000000"/>
         </w:rPr>
-        <w:t>EdgeTTS</w:t>
-      </w:r>
-      <w:proofErr w:type="spellEnd"/>
-      <w:r>
-        <w:rPr>
-          <w:rFonts w:cstheme="minorHAnsi"/>
-          <w:b/>
-          <w:bCs/>
-          <w:iCs/>
-          <w:color w:val="1B1C1D"/>
-          <w:sz w:val="24"/>
-          <w:szCs w:val="24"/>
-          <w:bdr w:val="none" w:sz="0" w:space="0" w:color="000000"/>
-        </w:rPr>
-        <w:t xml:space="preserve"> &amp; Whisper</w:t>
+        <w:t>EdgeTTS &amp; Whisper</w:t>
       </w:r>
       <w:r>
         <w:rPr>
@@ -10091,7 +9467,6 @@
           <w:bCs/>
           <w:iCs/>
         </w:rPr>
-        <w:lastRenderedPageBreak/>
         <w:t>Documentation Requirements</w:t>
       </w:r>
     </w:p>
@@ -10378,50 +9753,6 @@
           <w:lang w:val="en-CA" w:eastAsia="zh-CN" w:bidi="he-IL"/>
         </w:rPr>
       </w:pPr>
-      <w:r>
-        <w:rPr>
-          <w:rFonts w:cstheme="minorHAnsi"/>
-          <w:b/>
-          <w:bCs/>
-          <w:iCs/>
-          <w:sz w:val="24"/>
-          <w:szCs w:val="24"/>
-          <w:lang w:eastAsia="en-IN"/>
-        </w:rPr>
-        <w:t>DOC4. Release Notes &amp; Versioning:</w:t>
-      </w:r>
-      <w:r>
-        <w:rPr>
-          <w:rFonts w:cstheme="minorHAnsi"/>
-          <w:iCs/>
-          <w:sz w:val="24"/>
-          <w:szCs w:val="24"/>
-          <w:lang w:eastAsia="en-IN"/>
-        </w:rPr>
-        <w:t xml:space="preserve"> Each software update must include </w:t>
-      </w:r>
-      <w:r>
-        <w:rPr>
-          <w:rFonts w:cstheme="minorHAnsi"/>
-          <w:b/>
-          <w:bCs/>
-          <w:iCs/>
-          <w:sz w:val="24"/>
-          <w:szCs w:val="24"/>
-          <w:lang w:eastAsia="en-IN"/>
-        </w:rPr>
-        <w:t>release notes detailing new features, bug fixes, and improvements</w:t>
-      </w:r>
-      <w:r>
-        <w:rPr>
-          <w:rFonts w:cstheme="minorHAnsi"/>
-          <w:iCs/>
-          <w:sz w:val="24"/>
-          <w:szCs w:val="24"/>
-          <w:lang w:eastAsia="en-IN"/>
-        </w:rPr>
-        <w:t>.</w:t>
-      </w:r>
       <w:r>
         <w:rPr>
           <w:rFonts w:cstheme="minorHAnsi"/>
@@ -21745,7 +21076,6 @@
   <w:style w:type="character" w:default="1" w:styleId="DefaultParagraphFont">
     <w:name w:val="Default Paragraph Font"/>
     <w:uiPriority w:val="1"/>
-    <w:semiHidden/>
     <w:unhideWhenUsed/>
   </w:style>
   <w:style w:type="table" w:default="1" w:styleId="TableNormal">

</xml_diff>